<commit_message>
feat: modulo ninos exclusivo en aprende derechos, estructuracion de plantillas docx con negrillas y numeracion ordinal, y restriccion de descargas por rol (pdf ciudadano, docx/pdf asesores)
</commit_message>
<xml_diff>
--- a/LINXCO-HACKATON/plantillas/CIUDAD.docx
+++ b/LINXCO-HACKATON/plantillas/CIUDAD.docx
@@ -174,20 +174,200 @@
     </w:p>
     <w:p>
       <w:pPr>
-        <w:pStyle w:val="Ttulo1"/>
-        <w:rPr>
-          <w:rFonts w:ascii="Arial" w:hAnsi="Arial" w:cs="Arial"/>
-          <w:sz w:val="24"/>
-          <w:szCs w:val="24"/>
-        </w:rPr>
-      </w:pPr>
-      <w:r>
-        <w:rPr>
-          <w:rFonts w:ascii="Arial" w:hAnsi="Arial" w:cs="Arial"/>
-          <w:sz w:val="24"/>
-          <w:szCs w:val="24"/>
-        </w:rPr>
-        <w:t>HECHOS:</w:t>
+        <w:spacing w:before="140" w:after="80" w:line="240" w:lineRule="auto"/>
+        <w:rPr>
+          <w:rFonts w:ascii="Arial" w:hAnsi="Arial" w:cs="Arial"/>
+          <w:b/>
+          <w:bCs/>
+          <w:sz w:val="24"/>
+          <w:szCs w:val="24"/>
+        </w:rPr>
+      </w:pPr>
+      <w:r>
+        <w:rPr>
+          <w:rFonts w:ascii="Arial" w:hAnsi="Arial" w:cs="Arial"/>
+          <w:b/>
+          <w:bCs/>
+          <w:sz w:val="24"/>
+          <w:szCs w:val="24"/>
+        </w:rPr>
+        <w:t xml:space="preserve">HECHOS:</w:t>
+      </w:r>
+    </w:p>
+    <w:p>
+      <w:pPr>
+        <w:spacing w:before="80" w:after="80" w:line="240" w:lineRule="auto"/>
+        <w:rPr>
+          <w:rFonts w:ascii="Arial" w:hAnsi="Arial" w:cs="Arial"/>
+          <w:sz w:val="24"/>
+          <w:szCs w:val="24"/>
+        </w:rPr>
+      </w:pPr>
+      <w:r>
+        <w:rPr>
+          <w:rFonts w:ascii="Arial" w:hAnsi="Arial" w:cs="Arial"/>
+          <w:b/>
+          <w:bCs/>
+          <w:sz w:val="24"/>
+          <w:szCs w:val="24"/>
+        </w:rPr>
+        <w:t xml:space="preserve">PRIMERO </w:t>
+      </w:r>
+      <w:r>
+        <w:rPr>
+          <w:rFonts w:ascii="Arial" w:hAnsi="Arial" w:cs="Arial"/>
+          <w:sz w:val="24"/>
+          <w:szCs w:val="24"/>
+        </w:rPr>
+        <w:t xml:space="preserve">. En la vereda {{NOMBRE_VEREDA_CARRETERA}} , ubicada en el municipio de {{MUNICIPIO}} , departamento de {{DEPARTAMENTO}} , se encuentra una carretera rural localizada en el sector {{UBICACION_EXACTA_CARRETERA}} , particularmente en el tramo comprendido entre {{PUNTO_INICIO_TRAMO}} y {{PUNTO_FINAL_TRAMO}} . Esta vía constituye un medio de comunicación y desplazamiento utilizado por los habitantes del sector para desarrollar actividades cotidianas, productivas y comunitarias. Desde aproximadamente {{FECHA_INICIO_DETERIORO}} , la carretera presenta condiciones de deterioro caracterizadas por {{DESCRIPCION_DANOS_CARRETERA}} , circunstancia que ha dificultado progresivamente su utilización y puede comprometer las condiciones de seguridad de quienes transitan por ella.</w:t>
+      </w:r>
+    </w:p>
+    <w:p>
+      <w:pPr>
+        <w:spacing w:before="80" w:after="80" w:line="240" w:lineRule="auto"/>
+        <w:rPr>
+          <w:rFonts w:ascii="Arial" w:hAnsi="Arial" w:cs="Arial"/>
+          <w:sz w:val="24"/>
+          <w:szCs w:val="24"/>
+        </w:rPr>
+      </w:pPr>
+      <w:r>
+        <w:rPr>
+          <w:rFonts w:ascii="Arial" w:hAnsi="Arial" w:cs="Arial"/>
+          <w:b/>
+          <w:bCs/>
+          <w:sz w:val="24"/>
+          <w:szCs w:val="24"/>
+        </w:rPr>
+        <w:t xml:space="preserve">SEGUNDO </w:t>
+      </w:r>
+      <w:r>
+        <w:rPr>
+          <w:rFonts w:ascii="Arial" w:hAnsi="Arial" w:cs="Arial"/>
+          <w:sz w:val="24"/>
+          <w:szCs w:val="24"/>
+        </w:rPr>
+        <w:t xml:space="preserve">. El deterioro de la carretera ha generado afectaciones para los habitantes y usuarios de la vía, particularmente {{AFECTACIONES_A_LA_COMUNIDAD}} . Esta problemática afecta aproximadamente a {{NUMERO_PERSONAS_O_FAMILIAS_AFECTADAS}} , quienes utilizan habitualmente la carretera para {{USOS_PRINCIPALES_CARRETERA}} . En consecuencia, las dificultades de movilidad derivadas de su estado no se limitan a una afectación individual, sino que pueden repercutir sobre las condiciones de desplazamiento, comunicación y desarrollo de las actividades de una pluralidad de habitantes de la comunidad rural.</w:t>
+      </w:r>
+    </w:p>
+    <w:p>
+      <w:pPr>
+        <w:spacing w:before="80" w:after="80" w:line="240" w:lineRule="auto"/>
+        <w:rPr>
+          <w:rFonts w:ascii="Arial" w:hAnsi="Arial" w:cs="Arial"/>
+          <w:sz w:val="24"/>
+          <w:szCs w:val="24"/>
+        </w:rPr>
+      </w:pPr>
+      <w:r>
+        <w:rPr>
+          <w:rFonts w:ascii="Arial" w:hAnsi="Arial" w:cs="Arial"/>
+          <w:b/>
+          <w:bCs/>
+          <w:sz w:val="24"/>
+          <w:szCs w:val="24"/>
+        </w:rPr>
+        <w:t xml:space="preserve">TERCERO </w:t>
+      </w:r>
+      <w:r>
+        <w:rPr>
+          <w:rFonts w:ascii="Arial" w:hAnsi="Arial" w:cs="Arial"/>
+          <w:sz w:val="24"/>
+          <w:szCs w:val="24"/>
+        </w:rPr>
+        <w:t xml:space="preserve">. Las condiciones físicas de la carretera pueden representar riesgos para la seguridad de sus usuarios, especialmente ante la presencia de {{DESCRIPCION_RIESGOS_IDENTIFICADOS}} . Estas circunstancias requieren una valoración técnica que permita determinar la magnitud del deterioro, sus causas y la posibilidad de que se materialicen accidentes u otros eventos que comprometan la integridad de peatones, ciclistas, motociclistas, conductores, pasajeros y demás personas que utilizan la vía. La importancia de esta valoración radica en que las condiciones de seguridad vial no dependen únicamente de la posibilidad material de transitar por una carretera, sino también de que su infraestructura presente condiciones razonables de estabilidad, conservación y seguridad.</w:t>
+      </w:r>
+    </w:p>
+    <w:p>
+      <w:pPr>
+        <w:spacing w:before="80" w:after="80" w:line="240" w:lineRule="auto"/>
+        <w:rPr>
+          <w:rFonts w:ascii="Arial" w:hAnsi="Arial" w:cs="Arial"/>
+          <w:sz w:val="24"/>
+          <w:szCs w:val="24"/>
+        </w:rPr>
+      </w:pPr>
+      <w:r>
+        <w:rPr>
+          <w:rFonts w:ascii="Arial" w:hAnsi="Arial" w:cs="Arial"/>
+          <w:b/>
+          <w:bCs/>
+          <w:sz w:val="24"/>
+          <w:szCs w:val="24"/>
+        </w:rPr>
+        <w:t xml:space="preserve">CUARTO </w:t>
+      </w:r>
+      <w:r>
+        <w:rPr>
+          <w:rFonts w:ascii="Arial" w:hAnsi="Arial" w:cs="Arial"/>
+          <w:sz w:val="24"/>
+          <w:szCs w:val="24"/>
+        </w:rPr>
+        <w:t xml:space="preserve">. Los hechos anteriormente expuestos permiten advertir que el deterioro de la carretera objeto de esta petición trasciende una simple dificultad de movilidad o una incomodidad para sus usuarios. Cuando una vía destinada al tránsito comunitario presenta daños que comprometen su utilización segura, las consecuencias pueden extenderse a una pluralidad de personas que dependen de dicha infraestructura para sus desplazamientos y actividades cotidianas. Por ello, de acuerdo con la naturaleza jurídica de la vía y los riesgos que se acrediten, esta problemática puede amenazar derechos e intereses colectivos relacionados con la seguridad pública, el goce del espacio público y la utilización y defensa de los bienes de uso público, así como la seguridad y prevención de desastres previsibles técnicamente, reconocidos en el artículo 4 de la Ley 472 de 1998. En este sentido, resulta necesaria la intervención de las autoridades competentes para identificar y prevenir los riesgos derivados del deterioro de la infraestructura y adoptar las medidas administrativas, técnicas, preventivas y correctivas que correspondan.</w:t>
+      </w:r>
+    </w:p>
+    <w:p>
+      <w:pPr>
+        <w:spacing w:before="140" w:after="80" w:line="240" w:lineRule="auto"/>
+        <w:rPr>
+          <w:rFonts w:ascii="Arial" w:hAnsi="Arial" w:cs="Arial"/>
+          <w:b/>
+          <w:bCs/>
+          <w:sz w:val="24"/>
+          <w:szCs w:val="24"/>
+        </w:rPr>
+      </w:pPr>
+      <w:r>
+        <w:rPr>
+          <w:rFonts w:ascii="Arial" w:hAnsi="Arial" w:cs="Arial"/>
+          <w:b/>
+          <w:bCs/>
+          <w:sz w:val="24"/>
+          <w:szCs w:val="24"/>
+        </w:rPr>
+        <w:t xml:space="preserve">PETICIONES:</w:t>
+      </w:r>
+    </w:p>
+    <w:p>
+      <w:pPr>
+        <w:pStyle w:val="NormalWeb"/>
+        <w:rPr>
+          <w:rFonts w:ascii="Arial" w:hAnsi="Arial" w:cs="Arial"/>
+        </w:rPr>
+      </w:pPr>
+      <w:r>
+        <w:rPr>
+          <w:rFonts w:ascii="Arial" w:hAnsi="Arial" w:cs="Arial"/>
+        </w:rPr>
+        <w:t>Solicito respetuosamente, conforme al artículo 23 de la Constitución Política de Colombia:</w:t>
+      </w:r>
+    </w:p>
+    <w:p>
+      <w:pPr>
+        <w:spacing w:before="80" w:after="80" w:line="240" w:lineRule="auto"/>
+        <w:rPr>
+          <w:rFonts w:ascii="Arial" w:hAnsi="Arial" w:cs="Arial"/>
+          <w:sz w:val="24"/>
+          <w:szCs w:val="24"/>
+        </w:rPr>
+      </w:pPr>
+      <w:r>
+        <w:rPr>
+          <w:rFonts w:ascii="Arial" w:hAnsi="Arial" w:cs="Arial"/>
+          <w:b/>
+          <w:bCs/>
+          <w:sz w:val="24"/>
+          <w:szCs w:val="24"/>
+        </w:rPr>
+        <w:t xml:space="preserve">1.  </w:t>
+      </w:r>
+      <w:r>
+        <w:rPr>
+          <w:rFonts w:ascii="Arial" w:hAnsi="Arial" w:cs="Arial"/>
+          <w:sz w:val="24"/>
+          <w:szCs w:val="24"/>
+        </w:rPr>
+        <w:t xml:space="preserve">Se sirva adoptar, dentro del ámbito de sus competencias, las medidas administrativas, técnicas, preventivas y correctivas necesarias para la protección de los siguientes derechos e intereses colectivos que podrían encontrarse amenazados por el deterioro de la carretera ubicada en {{UBICACION_EXACTA_CARRETERA}} , vereda {{NOMBRE_VEREDA_CARRETERA}} :</w:t>
       </w:r>
     </w:p>
     <w:p>
@@ -202,375 +382,48 @@
           <w:rStyle w:val="Textoennegrita"/>
           <w:rFonts w:ascii="Arial" w:hAnsi="Arial" w:cs="Arial"/>
         </w:rPr>
-        <w:t>PRIMERO.</w:t>
-      </w:r>
-      <w:r>
-        <w:rPr>
-          <w:rFonts w:ascii="Arial" w:hAnsi="Arial" w:cs="Arial"/>
-        </w:rPr>
-        <w:t xml:space="preserve"> En la vereda </w:t>
-      </w:r>
+        <w:t>a) Seguridad y salubridad públicas (Ley 472 de 1998, artículo 4, literal g):</w:t>
+      </w:r>
+      <w:r>
+        <w:rPr>
+          <w:rFonts w:ascii="Arial" w:hAnsi="Arial" w:cs="Arial"/>
+        </w:rPr>
+        <w:t xml:space="preserve"> Las condiciones de deterioro de una carretera rural pueden comprometer la seguridad de sus usuarios cuando generan riesgos de accidentes, pérdida de estabilidad, obstáculos para la circulación u otras situaciones capaces de afectar la integridad de las personas. En consecuencia, resulta necesario adoptar las medidas técnicas y preventivas que correspondan para reducir los peligros asociados al estado de la infraestructura y proteger a los habitantes y demás personas que utilizan la vía.</w:t>
+      </w:r>
+    </w:p>
+    <w:p>
+      <w:pPr>
+        <w:pStyle w:val="NormalWeb"/>
+        <w:rPr>
+          <w:rFonts w:ascii="Arial" w:hAnsi="Arial" w:cs="Arial"/>
+        </w:rPr>
+      </w:pPr>
       <w:r>
         <w:rPr>
           <w:rStyle w:val="Textoennegrita"/>
           <w:rFonts w:ascii="Arial" w:hAnsi="Arial" w:cs="Arial"/>
         </w:rPr>
-        <w:t>{{NOMBRE_VEREDA_CARRETERA}}</w:t>
-      </w:r>
-      <w:r>
-        <w:rPr>
-          <w:rFonts w:ascii="Arial" w:hAnsi="Arial" w:cs="Arial"/>
-        </w:rPr>
-        <w:t xml:space="preserve">, ubicada en el municipio de </w:t>
-      </w:r>
+        <w:t>b) Goce del espacio público y utilización y defensa de los bienes de uso público (Ley 472 de 1998, artículo 4, literal d):</w:t>
+      </w:r>
+      <w:r>
+        <w:rPr>
+          <w:rFonts w:ascii="Arial" w:hAnsi="Arial" w:cs="Arial"/>
+        </w:rPr>
+        <w:t xml:space="preserve"> Cuando la carretera tiene naturaleza de vía pública, constituye una infraestructura destinada al uso común de la ciudadanía. Su deterioro puede dificultar que los habitantes ejerzan su derecho a utilizarla en condiciones razonables de seguridad. Por lo tanto, las actuaciones de conservación, mantenimiento y recuperación de la infraestructura pública resultan relevantes para garantizar su adecuada destinación y utilización colectiva.</w:t>
+      </w:r>
+    </w:p>
+    <w:p>
+      <w:pPr>
+        <w:pStyle w:val="NormalWeb"/>
+        <w:rPr>
+          <w:rFonts w:ascii="Arial" w:hAnsi="Arial" w:cs="Arial"/>
+        </w:rPr>
+      </w:pPr>
       <w:r>
         <w:rPr>
           <w:rStyle w:val="Textoennegrita"/>
           <w:rFonts w:ascii="Arial" w:hAnsi="Arial" w:cs="Arial"/>
         </w:rPr>
-        <w:t>{{MUNICIPIO}}</w:t>
-      </w:r>
-      <w:r>
-        <w:rPr>
-          <w:rFonts w:ascii="Arial" w:hAnsi="Arial" w:cs="Arial"/>
-        </w:rPr>
-        <w:t xml:space="preserve">, departamento de </w:t>
-      </w:r>
-      <w:r>
-        <w:rPr>
-          <w:rStyle w:val="Textoennegrita"/>
-          <w:rFonts w:ascii="Arial" w:hAnsi="Arial" w:cs="Arial"/>
-        </w:rPr>
-        <w:t>{{DEPARTAMENTO}}</w:t>
-      </w:r>
-      <w:r>
-        <w:rPr>
-          <w:rFonts w:ascii="Arial" w:hAnsi="Arial" w:cs="Arial"/>
-        </w:rPr>
-        <w:t xml:space="preserve">, se encuentra una carretera rural localizada en el sector </w:t>
-      </w:r>
-      <w:r>
-        <w:rPr>
-          <w:rStyle w:val="Textoennegrita"/>
-          <w:rFonts w:ascii="Arial" w:hAnsi="Arial" w:cs="Arial"/>
-        </w:rPr>
-        <w:t>{{UBICACION_EXACTA_CARRETERA}}</w:t>
-      </w:r>
-      <w:r>
-        <w:rPr>
-          <w:rFonts w:ascii="Arial" w:hAnsi="Arial" w:cs="Arial"/>
-        </w:rPr>
-        <w:t xml:space="preserve">, particularmente en el tramo comprendido entre </w:t>
-      </w:r>
-      <w:r>
-        <w:rPr>
-          <w:rStyle w:val="Textoennegrita"/>
-          <w:rFonts w:ascii="Arial" w:hAnsi="Arial" w:cs="Arial"/>
-        </w:rPr>
-        <w:t>{{PUNTO_INICIO_TRAMO}}</w:t>
-      </w:r>
-      <w:r>
-        <w:rPr>
-          <w:rFonts w:ascii="Arial" w:hAnsi="Arial" w:cs="Arial"/>
-        </w:rPr>
-        <w:t xml:space="preserve"> y </w:t>
-      </w:r>
-      <w:r>
-        <w:rPr>
-          <w:rStyle w:val="Textoennegrita"/>
-          <w:rFonts w:ascii="Arial" w:hAnsi="Arial" w:cs="Arial"/>
-        </w:rPr>
-        <w:t>{{PUNTO_FINAL_TRAMO}}</w:t>
-      </w:r>
-      <w:r>
-        <w:rPr>
-          <w:rFonts w:ascii="Arial" w:hAnsi="Arial" w:cs="Arial"/>
-        </w:rPr>
-        <w:t xml:space="preserve">. Esta vía constituye un medio de comunicación y desplazamiento utilizado por los habitantes del sector para desarrollar actividades cotidianas, productivas y comunitarias. Desde aproximadamente </w:t>
-      </w:r>
-      <w:r>
-        <w:rPr>
-          <w:rStyle w:val="Textoennegrita"/>
-          <w:rFonts w:ascii="Arial" w:hAnsi="Arial" w:cs="Arial"/>
-        </w:rPr>
-        <w:t>{{FECHA_INICIO_DETERIORO}}</w:t>
-      </w:r>
-      <w:r>
-        <w:rPr>
-          <w:rFonts w:ascii="Arial" w:hAnsi="Arial" w:cs="Arial"/>
-        </w:rPr>
-        <w:t xml:space="preserve">, la carretera presenta condiciones de deterioro caracterizadas por </w:t>
-      </w:r>
-      <w:r>
-        <w:rPr>
-          <w:rStyle w:val="Textoennegrita"/>
-          <w:rFonts w:ascii="Arial" w:hAnsi="Arial" w:cs="Arial"/>
-        </w:rPr>
-        <w:t>{{DESCRIPCION_DANOS_CARRETERA}}</w:t>
-      </w:r>
-      <w:r>
-        <w:rPr>
-          <w:rFonts w:ascii="Arial" w:hAnsi="Arial" w:cs="Arial"/>
-        </w:rPr>
-        <w:t>, circunstancia que ha dificultado progresivamente su utilización y puede comprometer las condiciones de seguridad de quienes transitan por ella.</w:t>
-      </w:r>
-    </w:p>
-    <w:p>
-      <w:pPr>
-        <w:pStyle w:val="NormalWeb"/>
-        <w:rPr>
-          <w:rFonts w:ascii="Arial" w:hAnsi="Arial" w:cs="Arial"/>
-        </w:rPr>
-      </w:pPr>
-      <w:r>
-        <w:rPr>
-          <w:rStyle w:val="Textoennegrita"/>
-          <w:rFonts w:ascii="Arial" w:hAnsi="Arial" w:cs="Arial"/>
-        </w:rPr>
-        <w:lastRenderedPageBreak/>
-        <w:t>SEGUNDO.</w:t>
-      </w:r>
-      <w:r>
-        <w:rPr>
-          <w:rFonts w:ascii="Arial" w:hAnsi="Arial" w:cs="Arial"/>
-        </w:rPr>
-        <w:t xml:space="preserve"> El deterioro de la carretera ha generado afectaciones para los habitantes y usuarios de la vía, particularmente </w:t>
-      </w:r>
-      <w:r>
-        <w:rPr>
-          <w:rStyle w:val="Textoennegrita"/>
-          <w:rFonts w:ascii="Arial" w:hAnsi="Arial" w:cs="Arial"/>
-        </w:rPr>
-        <w:t>{{AFECTACIONES_A_LA_COMUNIDAD}}</w:t>
-      </w:r>
-      <w:r>
-        <w:rPr>
-          <w:rFonts w:ascii="Arial" w:hAnsi="Arial" w:cs="Arial"/>
-        </w:rPr>
-        <w:t xml:space="preserve">. Esta problemática afecta aproximadamente a </w:t>
-      </w:r>
-      <w:r>
-        <w:rPr>
-          <w:rStyle w:val="Textoennegrita"/>
-          <w:rFonts w:ascii="Arial" w:hAnsi="Arial" w:cs="Arial"/>
-        </w:rPr>
-        <w:t>{{NUMERO_PERSONAS_O_FAMILIAS_AFECTADAS}}</w:t>
-      </w:r>
-      <w:r>
-        <w:rPr>
-          <w:rFonts w:ascii="Arial" w:hAnsi="Arial" w:cs="Arial"/>
-        </w:rPr>
-        <w:t xml:space="preserve">, quienes utilizan habitualmente la carretera para </w:t>
-      </w:r>
-      <w:r>
-        <w:rPr>
-          <w:rStyle w:val="Textoennegrita"/>
-          <w:rFonts w:ascii="Arial" w:hAnsi="Arial" w:cs="Arial"/>
-        </w:rPr>
-        <w:t>{{USOS_PRINCIPALES_CARRETERA}}</w:t>
-      </w:r>
-      <w:r>
-        <w:rPr>
-          <w:rFonts w:ascii="Arial" w:hAnsi="Arial" w:cs="Arial"/>
-        </w:rPr>
-        <w:t>. En consecuencia, las dificultades de movilidad derivadas de su estado no se limitan a una afectación individual, sino que pueden repercutir sobre las condiciones de desplazamiento, comunicación y desarrollo de las actividades de una pluralidad de habitantes de la comunidad rural.</w:t>
-      </w:r>
-    </w:p>
-    <w:p>
-      <w:pPr>
-        <w:pStyle w:val="NormalWeb"/>
-        <w:rPr>
-          <w:rFonts w:ascii="Arial" w:hAnsi="Arial" w:cs="Arial"/>
-        </w:rPr>
-      </w:pPr>
-      <w:r>
-        <w:rPr>
-          <w:rStyle w:val="Textoennegrita"/>
-          <w:rFonts w:ascii="Arial" w:hAnsi="Arial" w:cs="Arial"/>
-        </w:rPr>
-        <w:t>TERCERO.</w:t>
-      </w:r>
-      <w:r>
-        <w:rPr>
-          <w:rFonts w:ascii="Arial" w:hAnsi="Arial" w:cs="Arial"/>
-        </w:rPr>
-        <w:t xml:space="preserve"> Las condiciones físicas de la carretera pueden representar riesgos para la seguridad de sus usuarios, especialmente ante la presencia de </w:t>
-      </w:r>
-      <w:r>
-        <w:rPr>
-          <w:rStyle w:val="Textoennegrita"/>
-          <w:rFonts w:ascii="Arial" w:hAnsi="Arial" w:cs="Arial"/>
-        </w:rPr>
-        <w:t>{{DESCRIPCION_RIESGOS_IDENTIFICADOS}}</w:t>
-      </w:r>
-      <w:r>
-        <w:rPr>
-          <w:rFonts w:ascii="Arial" w:hAnsi="Arial" w:cs="Arial"/>
-        </w:rPr>
-        <w:t>. Estas circunstancias requieren una valoración técnica que permita determinar la magnitud del deterioro, sus causas y la posibilidad de que se materialicen accidentes u otros eventos que comprometan la integridad de peatones, ciclistas, motociclistas, conductores, pasajeros y demás personas que utilizan la vía. La importancia de esta valoración radica en que las condiciones de seguridad vial no dependen únicamente de la posibilidad material de transitar por una carretera, sino también de que su infraestructura presente condiciones razonables de estabilidad, conservación y seguridad.</w:t>
-      </w:r>
-    </w:p>
-    <w:p>
-      <w:pPr>
-        <w:pStyle w:val="NormalWeb"/>
-        <w:rPr>
-          <w:rFonts w:ascii="Arial" w:hAnsi="Arial" w:cs="Arial"/>
-        </w:rPr>
-      </w:pPr>
-      <w:r>
-        <w:rPr>
-          <w:rStyle w:val="Textoennegrita"/>
-          <w:rFonts w:ascii="Arial" w:hAnsi="Arial" w:cs="Arial"/>
-        </w:rPr>
-        <w:t>CUARTO.</w:t>
-      </w:r>
-      <w:r>
-        <w:rPr>
-          <w:rFonts w:ascii="Arial" w:hAnsi="Arial" w:cs="Arial"/>
-        </w:rPr>
-        <w:t xml:space="preserve"> Los hechos anteriormente expuestos permiten advertir que el deterioro de la carretera objeto de esta petición trasciende una simple dificultad de movilidad o una incomodidad para sus usuarios. Cuando una vía destinada al tránsito comunitario presenta daños que comprometen su utilización segura, las consecuencias pueden extenderse a una pluralidad de personas que dependen de dicha infraestructura para sus desplazamientos y actividades cotidianas. Por ello, de acuerdo con la naturaleza jurídica de la vía y los riesgos que se acrediten, esta problemática puede amenazar derechos e intereses colectivos relacionados con la seguridad pública, el goce del espacio público y la utilización y defensa de los bienes de uso público, así como la seguridad y prevención de desastres previsibles técnicamente, reconocidos en el artículo 4 de la Ley 472 de 1998. En este sentido, resulta necesaria la intervención de las autoridades competentes para identificar y prevenir los riesgos derivados del deterioro de la infraestructura y adoptar las medidas administrativas, técnicas, preventivas y correctivas que correspondan.</w:t>
-      </w:r>
-    </w:p>
-    <w:p>
-      <w:pPr>
-        <w:pStyle w:val="Ttulo1"/>
-        <w:rPr>
-          <w:rFonts w:ascii="Arial" w:hAnsi="Arial" w:cs="Arial"/>
-          <w:sz w:val="24"/>
-          <w:szCs w:val="24"/>
-        </w:rPr>
-      </w:pPr>
-      <w:r>
-        <w:rPr>
-          <w:rFonts w:ascii="Arial" w:hAnsi="Arial" w:cs="Arial"/>
-          <w:sz w:val="24"/>
-          <w:szCs w:val="24"/>
-        </w:rPr>
-        <w:t>PETICIONES:</w:t>
-      </w:r>
-    </w:p>
-    <w:p>
-      <w:pPr>
-        <w:pStyle w:val="NormalWeb"/>
-        <w:rPr>
-          <w:rFonts w:ascii="Arial" w:hAnsi="Arial" w:cs="Arial"/>
-        </w:rPr>
-      </w:pPr>
-      <w:r>
-        <w:rPr>
-          <w:rFonts w:ascii="Arial" w:hAnsi="Arial" w:cs="Arial"/>
-        </w:rPr>
-        <w:t>Solicito respetuosamente, conforme al artículo 23 de la Constitución Política de Colombia:</w:t>
-      </w:r>
-    </w:p>
-    <w:p>
-      <w:pPr>
-        <w:pStyle w:val="NormalWeb"/>
-        <w:rPr>
-          <w:rFonts w:ascii="Arial" w:hAnsi="Arial" w:cs="Arial"/>
-        </w:rPr>
-      </w:pPr>
-      <w:r>
-        <w:rPr>
-          <w:rStyle w:val="Textoennegrita"/>
-          <w:rFonts w:ascii="Arial" w:hAnsi="Arial" w:cs="Arial"/>
-        </w:rPr>
-        <w:t>1.</w:t>
-      </w:r>
-      <w:r>
-        <w:rPr>
-          <w:rFonts w:ascii="Arial" w:hAnsi="Arial" w:cs="Arial"/>
-        </w:rPr>
-        <w:t xml:space="preserve"> Se sirva adoptar, dentro del ámbito de sus competencias, las medidas administrativas, técnicas, preventivas y correctivas necesarias para la protección de los siguientes derechos e intereses colectivos que podrían encontrarse </w:t>
-      </w:r>
-      <w:r>
-        <w:rPr>
-          <w:rFonts w:ascii="Arial" w:hAnsi="Arial" w:cs="Arial"/>
-        </w:rPr>
-        <w:lastRenderedPageBreak/>
-        <w:t xml:space="preserve">amenazados por el deterioro de la carretera ubicada en </w:t>
-      </w:r>
-      <w:r>
-        <w:rPr>
-          <w:rStyle w:val="Textoennegrita"/>
-          <w:rFonts w:ascii="Arial" w:hAnsi="Arial" w:cs="Arial"/>
-        </w:rPr>
-        <w:t>{{UBICACION_EXACTA_CARRETERA}}</w:t>
-      </w:r>
-      <w:r>
-        <w:rPr>
-          <w:rFonts w:ascii="Arial" w:hAnsi="Arial" w:cs="Arial"/>
-        </w:rPr>
-        <w:t xml:space="preserve">, vereda </w:t>
-      </w:r>
-      <w:r>
-        <w:rPr>
-          <w:rStyle w:val="Textoennegrita"/>
-          <w:rFonts w:ascii="Arial" w:hAnsi="Arial" w:cs="Arial"/>
-        </w:rPr>
-        <w:t>{{NOMBRE_VEREDA_CARRETERA}}</w:t>
-      </w:r>
-      <w:r>
-        <w:rPr>
-          <w:rFonts w:ascii="Arial" w:hAnsi="Arial" w:cs="Arial"/>
-        </w:rPr>
-        <w:t>:</w:t>
-      </w:r>
-    </w:p>
-    <w:p>
-      <w:pPr>
-        <w:pStyle w:val="NormalWeb"/>
-        <w:rPr>
-          <w:rFonts w:ascii="Arial" w:hAnsi="Arial" w:cs="Arial"/>
-        </w:rPr>
-      </w:pPr>
-      <w:r>
-        <w:rPr>
-          <w:rStyle w:val="Textoennegrita"/>
-          <w:rFonts w:ascii="Arial" w:hAnsi="Arial" w:cs="Arial"/>
-        </w:rPr>
-        <w:t>a) Seguridad y salubridad públicas (Ley 472 de 1998, artículo 4, literal g):</w:t>
-      </w:r>
-      <w:r>
-        <w:rPr>
-          <w:rFonts w:ascii="Arial" w:hAnsi="Arial" w:cs="Arial"/>
-        </w:rPr>
-        <w:t xml:space="preserve"> Las condiciones de deterioro de una carretera rural pueden comprometer la seguridad de sus usuarios cuando generan riesgos de accidentes, pérdida de estabilidad, obstáculos para la circulación u otras situaciones capaces de afectar la integridad de las personas. En consecuencia, resulta necesario adoptar las medidas técnicas y preventivas que correspondan para reducir los peligros asociados al estado de la infraestructura y proteger a los habitantes y demás personas que utilizan la vía.</w:t>
-      </w:r>
-    </w:p>
-    <w:p>
-      <w:pPr>
-        <w:pStyle w:val="NormalWeb"/>
-        <w:rPr>
-          <w:rFonts w:ascii="Arial" w:hAnsi="Arial" w:cs="Arial"/>
-        </w:rPr>
-      </w:pPr>
-      <w:r>
-        <w:rPr>
-          <w:rStyle w:val="Textoennegrita"/>
-          <w:rFonts w:ascii="Arial" w:hAnsi="Arial" w:cs="Arial"/>
-        </w:rPr>
-        <w:t>b) Goce del espacio público y utilización y defensa de los bienes de uso público (Ley 472 de 1998, artículo 4, literal d):</w:t>
-      </w:r>
-      <w:r>
-        <w:rPr>
-          <w:rFonts w:ascii="Arial" w:hAnsi="Arial" w:cs="Arial"/>
-        </w:rPr>
-        <w:t xml:space="preserve"> Cuando la carretera tiene naturaleza de vía pública, constituye una infraestructura destinada al uso común de la ciudadanía. Su deterioro puede dificultar que los habitantes ejerzan su derecho a utilizarla en condiciones razonables de seguridad. Por lo tanto, las actuaciones de conservación, mantenimiento y recuperación de la infraestructura pública resultan relevantes para garantizar su adecuada destinación y utilización colectiva.</w:t>
-      </w:r>
-    </w:p>
-    <w:p>
-      <w:pPr>
-        <w:pStyle w:val="NormalWeb"/>
-        <w:rPr>
-          <w:rFonts w:ascii="Arial" w:hAnsi="Arial" w:cs="Arial"/>
-        </w:rPr>
-      </w:pPr>
-      <w:r>
-        <w:rPr>
-          <w:rStyle w:val="Textoennegrita"/>
-          <w:rFonts w:ascii="Arial" w:hAnsi="Arial" w:cs="Arial"/>
-        </w:rPr>
         <w:t>c) Derecho a la seguridad y prevención de desastres previsibles técnicamente (Ley 472 de 1998, artículo 4, literal l):</w:t>
       </w:r>
       <w:r>
@@ -582,62 +435,30 @@
     </w:p>
     <w:p>
       <w:pPr>
-        <w:pStyle w:val="NormalWeb"/>
-        <w:rPr>
-          <w:rFonts w:ascii="Arial" w:hAnsi="Arial" w:cs="Arial"/>
-        </w:rPr>
-      </w:pPr>
-      <w:r>
-        <w:rPr>
-          <w:rStyle w:val="Textoennegrita"/>
-          <w:rFonts w:ascii="Arial" w:hAnsi="Arial" w:cs="Arial"/>
-        </w:rPr>
-        <w:t>2.</w:t>
-      </w:r>
-      <w:r>
-        <w:rPr>
-          <w:rFonts w:ascii="Arial" w:hAnsi="Arial" w:cs="Arial"/>
-        </w:rPr>
-        <w:t xml:space="preserve"> Realizar una inspección y diagnóstico técnico integral de la carretera ubicada en la vereda </w:t>
-      </w:r>
-      <w:r>
-        <w:rPr>
-          <w:rStyle w:val="Textoennegrita"/>
-          <w:rFonts w:ascii="Arial" w:hAnsi="Arial" w:cs="Arial"/>
-        </w:rPr>
-        <w:t>{{NOMBRE_VEREDA_CARRETERA}}</w:t>
-      </w:r>
-      <w:r>
-        <w:rPr>
-          <w:rFonts w:ascii="Arial" w:hAnsi="Arial" w:cs="Arial"/>
-        </w:rPr>
-        <w:t xml:space="preserve">, específicamente en el tramo comprendido entre </w:t>
-      </w:r>
-      <w:r>
-        <w:rPr>
-          <w:rStyle w:val="Textoennegrita"/>
-          <w:rFonts w:ascii="Arial" w:hAnsi="Arial" w:cs="Arial"/>
-        </w:rPr>
-        <w:t>{{PUNTO_INICIO_TRAMO}}</w:t>
-      </w:r>
-      <w:r>
-        <w:rPr>
-          <w:rFonts w:ascii="Arial" w:hAnsi="Arial" w:cs="Arial"/>
-        </w:rPr>
-        <w:t xml:space="preserve"> y </w:t>
-      </w:r>
-      <w:r>
-        <w:rPr>
-          <w:rStyle w:val="Textoennegrita"/>
-          <w:rFonts w:ascii="Arial" w:hAnsi="Arial" w:cs="Arial"/>
-        </w:rPr>
-        <w:t>{{PUNTO_FINAL_TRAMO}}</w:t>
-      </w:r>
-      <w:r>
-        <w:rPr>
-          <w:rFonts w:ascii="Arial" w:hAnsi="Arial" w:cs="Arial"/>
-        </w:rPr>
-        <w:t>, con el propósito de identificar las causas y la magnitud del deterioro, evaluar sus condiciones actuales de estabilidad, seguridad y transitabilidad, y determinar las intervenciones técnicas necesarias.</w:t>
+        <w:spacing w:before="80" w:after="80" w:line="240" w:lineRule="auto"/>
+        <w:rPr>
+          <w:rFonts w:ascii="Arial" w:hAnsi="Arial" w:cs="Arial"/>
+          <w:sz w:val="24"/>
+          <w:szCs w:val="24"/>
+        </w:rPr>
+      </w:pPr>
+      <w:r>
+        <w:rPr>
+          <w:rFonts w:ascii="Arial" w:hAnsi="Arial" w:cs="Arial"/>
+          <w:b/>
+          <w:bCs/>
+          <w:sz w:val="24"/>
+          <w:szCs w:val="24"/>
+        </w:rPr>
+        <w:t xml:space="preserve">2.  </w:t>
+      </w:r>
+      <w:r>
+        <w:rPr>
+          <w:rFonts w:ascii="Arial" w:hAnsi="Arial" w:cs="Arial"/>
+          <w:sz w:val="24"/>
+          <w:szCs w:val="24"/>
+        </w:rPr>
+        <w:t xml:space="preserve">Realizar una inspección y diagnóstico técnico integral de la carretera ubicada en la vereda {{NOMBRE_VEREDA_CARRETERA}} , específicamente en el tramo comprendido entre {{PUNTO_INICIO_TRAMO}} y {{PUNTO_FINAL_TRAMO}} , con el propósito de identificar las causas y la magnitud del deterioro, evaluar sus condiciones actuales de estabilidad, seguridad y transitabilidad, y determinar las intervenciones técnicas necesarias.</w:t>
       </w:r>
     </w:p>
     <w:p>
@@ -656,23 +477,30 @@
     </w:p>
     <w:p>
       <w:pPr>
-        <w:pStyle w:val="NormalWeb"/>
-        <w:rPr>
-          <w:rFonts w:ascii="Arial" w:hAnsi="Arial" w:cs="Arial"/>
-        </w:rPr>
-      </w:pPr>
-      <w:r>
-        <w:rPr>
-          <w:rStyle w:val="Textoennegrita"/>
-          <w:rFonts w:ascii="Arial" w:hAnsi="Arial" w:cs="Arial"/>
-        </w:rPr>
-        <w:t>3.</w:t>
-      </w:r>
-      <w:r>
-        <w:rPr>
-          <w:rFonts w:ascii="Arial" w:hAnsi="Arial" w:cs="Arial"/>
-        </w:rPr>
-        <w:t xml:space="preserve"> Adoptar las medidas administrativas, técnicas y operativas necesarias para gestionar y ejecutar las intervenciones de mantenimiento, reparación, recuperación o rehabilitación que requiera la carretera, de acuerdo con los resultados del diagnóstico técnico y las competencias de la entidad responsable.</w:t>
+        <w:spacing w:before="80" w:after="80" w:line="240" w:lineRule="auto"/>
+        <w:rPr>
+          <w:rFonts w:ascii="Arial" w:hAnsi="Arial" w:cs="Arial"/>
+          <w:sz w:val="24"/>
+          <w:szCs w:val="24"/>
+        </w:rPr>
+      </w:pPr>
+      <w:r>
+        <w:rPr>
+          <w:rFonts w:ascii="Arial" w:hAnsi="Arial" w:cs="Arial"/>
+          <w:b/>
+          <w:bCs/>
+          <w:sz w:val="24"/>
+          <w:szCs w:val="24"/>
+        </w:rPr>
+        <w:t xml:space="preserve">3.  </w:t>
+      </w:r>
+      <w:r>
+        <w:rPr>
+          <w:rFonts w:ascii="Arial" w:hAnsi="Arial" w:cs="Arial"/>
+          <w:sz w:val="24"/>
+          <w:szCs w:val="24"/>
+        </w:rPr>
+        <w:t xml:space="preserve">Adoptar las medidas administrativas, técnicas y operativas necesarias para gestionar y ejecutar las intervenciones de mantenimiento, reparación, recuperación o rehabilitación que requiera la carretera, de acuerdo con los resultados del diagnóstico técnico y las competencias de la entidad responsable.</w:t>
       </w:r>
     </w:p>
     <w:p>
@@ -692,23 +520,30 @@
     </w:p>
     <w:p>
       <w:pPr>
-        <w:pStyle w:val="NormalWeb"/>
-        <w:rPr>
-          <w:rFonts w:ascii="Arial" w:hAnsi="Arial" w:cs="Arial"/>
-        </w:rPr>
-      </w:pPr>
-      <w:r>
-        <w:rPr>
-          <w:rStyle w:val="Textoennegrita"/>
-          <w:rFonts w:ascii="Arial" w:hAnsi="Arial" w:cs="Arial"/>
-        </w:rPr>
-        <w:t>4.</w:t>
-      </w:r>
-      <w:r>
-        <w:rPr>
-          <w:rFonts w:ascii="Arial" w:hAnsi="Arial" w:cs="Arial"/>
-        </w:rPr>
-        <w:t xml:space="preserve"> Adoptar oportunamente las medidas preventivas y de contingencia necesarias para reducir los riesgos existentes mientras se ejecutan las reparaciones o intervenciones definitivas que resulten procedentes.</w:t>
+        <w:spacing w:before="80" w:after="80" w:line="240" w:lineRule="auto"/>
+        <w:rPr>
+          <w:rFonts w:ascii="Arial" w:hAnsi="Arial" w:cs="Arial"/>
+          <w:sz w:val="24"/>
+          <w:szCs w:val="24"/>
+        </w:rPr>
+      </w:pPr>
+      <w:r>
+        <w:rPr>
+          <w:rFonts w:ascii="Arial" w:hAnsi="Arial" w:cs="Arial"/>
+          <w:b/>
+          <w:bCs/>
+          <w:sz w:val="24"/>
+          <w:szCs w:val="24"/>
+        </w:rPr>
+        <w:t xml:space="preserve">4.  </w:t>
+      </w:r>
+      <w:r>
+        <w:rPr>
+          <w:rFonts w:ascii="Arial" w:hAnsi="Arial" w:cs="Arial"/>
+          <w:sz w:val="24"/>
+          <w:szCs w:val="24"/>
+        </w:rPr>
+        <w:t xml:space="preserve">Adoptar oportunamente las medidas preventivas y de contingencia necesarias para reducir los riesgos existentes mientras se ejecutan las reparaciones o intervenciones definitivas que resulten procedentes.</w:t>
       </w:r>
     </w:p>
     <w:p>
@@ -727,23 +562,30 @@
     </w:p>
     <w:p>
       <w:pPr>
-        <w:pStyle w:val="NormalWeb"/>
-        <w:rPr>
-          <w:rFonts w:ascii="Arial" w:hAnsi="Arial" w:cs="Arial"/>
-        </w:rPr>
-      </w:pPr>
-      <w:r>
-        <w:rPr>
-          <w:rStyle w:val="Textoennegrita"/>
-          <w:rFonts w:ascii="Arial" w:hAnsi="Arial" w:cs="Arial"/>
-        </w:rPr>
-        <w:t>5.</w:t>
-      </w:r>
-      <w:r>
-        <w:rPr>
-          <w:rFonts w:ascii="Arial" w:hAnsi="Arial" w:cs="Arial"/>
-        </w:rPr>
-        <w:t xml:space="preserve"> Adelantar las actuaciones presupuestales, contractuales, administrativas y de planeación necesarias para estructurar, priorizar, programar y ejecutar las intervenciones que requiera la carretera objeto de esta petición, conforme a las competencias de la entidad responsable y a las disposiciones legales aplicables.</w:t>
+        <w:spacing w:before="80" w:after="80" w:line="240" w:lineRule="auto"/>
+        <w:rPr>
+          <w:rFonts w:ascii="Arial" w:hAnsi="Arial" w:cs="Arial"/>
+          <w:sz w:val="24"/>
+          <w:szCs w:val="24"/>
+        </w:rPr>
+      </w:pPr>
+      <w:r>
+        <w:rPr>
+          <w:rFonts w:ascii="Arial" w:hAnsi="Arial" w:cs="Arial"/>
+          <w:b/>
+          <w:bCs/>
+          <w:sz w:val="24"/>
+          <w:szCs w:val="24"/>
+        </w:rPr>
+        <w:t xml:space="preserve">5.  </w:t>
+      </w:r>
+      <w:r>
+        <w:rPr>
+          <w:rFonts w:ascii="Arial" w:hAnsi="Arial" w:cs="Arial"/>
+          <w:sz w:val="24"/>
+          <w:szCs w:val="24"/>
+        </w:rPr>
+        <w:t xml:space="preserve">Adelantar las actuaciones presupuestales, contractuales, administrativas y de planeación necesarias para estructurar, priorizar, programar y ejecutar las intervenciones que requiera la carretera objeto de esta petición, conforme a las competencias de la entidad responsable y a las disposiciones legales aplicables.</w:t>
       </w:r>
     </w:p>
     <w:p>
@@ -762,23 +604,30 @@
     </w:p>
     <w:p>
       <w:pPr>
-        <w:pStyle w:val="NormalWeb"/>
-        <w:rPr>
-          <w:rFonts w:ascii="Arial" w:hAnsi="Arial" w:cs="Arial"/>
-        </w:rPr>
-      </w:pPr>
-      <w:r>
-        <w:rPr>
-          <w:rStyle w:val="Textoennegrita"/>
-          <w:rFonts w:ascii="Arial" w:hAnsi="Arial" w:cs="Arial"/>
-        </w:rPr>
-        <w:t>6.</w:t>
-      </w:r>
-      <w:r>
-        <w:rPr>
-          <w:rFonts w:ascii="Arial" w:hAnsi="Arial" w:cs="Arial"/>
-        </w:rPr>
-        <w:t xml:space="preserve"> Adoptar las medidas de articulación y coordinación institucional que resulten necesarias entre las autoridades responsables de la infraestructura vial, su mantenimiento y conservación, la seguridad vial y la gestión del riesgo, cuando la naturaleza de los daños o las competencias involucradas requieran una actuación conjunta.</w:t>
+        <w:spacing w:before="80" w:after="80" w:line="240" w:lineRule="auto"/>
+        <w:rPr>
+          <w:rFonts w:ascii="Arial" w:hAnsi="Arial" w:cs="Arial"/>
+          <w:sz w:val="24"/>
+          <w:szCs w:val="24"/>
+        </w:rPr>
+      </w:pPr>
+      <w:r>
+        <w:rPr>
+          <w:rFonts w:ascii="Arial" w:hAnsi="Arial" w:cs="Arial"/>
+          <w:b/>
+          <w:bCs/>
+          <w:sz w:val="24"/>
+          <w:szCs w:val="24"/>
+        </w:rPr>
+        <w:t xml:space="preserve">6.  </w:t>
+      </w:r>
+      <w:r>
+        <w:rPr>
+          <w:rFonts w:ascii="Arial" w:hAnsi="Arial" w:cs="Arial"/>
+          <w:sz w:val="24"/>
+          <w:szCs w:val="24"/>
+        </w:rPr>
+        <w:t xml:space="preserve">Adoptar las medidas de articulación y coordinación institucional que resulten necesarias entre las autoridades responsables de la infraestructura vial, su mantenimiento y conservación, la seguridad vial y la gestión del riesgo, cuando la naturaleza de los daños o las competencias involucradas requieran una actuación conjunta.</w:t>
       </w:r>
     </w:p>
     <w:p>
@@ -797,20 +646,24 @@
     </w:p>
     <w:p>
       <w:pPr>
-        <w:pStyle w:val="Ttulo1"/>
-        <w:rPr>
-          <w:rFonts w:ascii="Arial" w:hAnsi="Arial" w:cs="Arial"/>
-          <w:sz w:val="24"/>
-          <w:szCs w:val="24"/>
-        </w:rPr>
-      </w:pPr>
-      <w:r>
-        <w:rPr>
-          <w:rFonts w:ascii="Arial" w:hAnsi="Arial" w:cs="Arial"/>
-          <w:sz w:val="24"/>
-          <w:szCs w:val="24"/>
-        </w:rPr>
-        <w:t>FUNDAMENTOS DE DERECHO</w:t>
+        <w:spacing w:before="140" w:after="80" w:line="240" w:lineRule="auto"/>
+        <w:rPr>
+          <w:rFonts w:ascii="Arial" w:hAnsi="Arial" w:cs="Arial"/>
+          <w:b/>
+          <w:bCs/>
+          <w:sz w:val="24"/>
+          <w:szCs w:val="24"/>
+        </w:rPr>
+      </w:pPr>
+      <w:r>
+        <w:rPr>
+          <w:rFonts w:ascii="Arial" w:hAnsi="Arial" w:cs="Arial"/>
+          <w:b/>
+          <w:bCs/>
+          <w:sz w:val="24"/>
+          <w:szCs w:val="24"/>
+        </w:rPr>
+        <w:t xml:space="preserve">FUNDAMENTOS DE DERECHO</w:t>
       </w:r>
     </w:p>
     <w:p>
@@ -1033,83 +886,108 @@
     </w:p>
     <w:p>
       <w:pPr>
-        <w:pStyle w:val="NormalWeb"/>
-        <w:rPr>
-          <w:rFonts w:ascii="Arial" w:hAnsi="Arial" w:cs="Arial"/>
-        </w:rPr>
-      </w:pPr>
-      <w:r>
-        <w:rPr>
-          <w:rStyle w:val="Textoennegrita"/>
-          <w:rFonts w:ascii="Arial" w:hAnsi="Arial" w:cs="Arial"/>
-        </w:rPr>
-        <w:t>1.1.</w:t>
-      </w:r>
-      <w:r>
-        <w:rPr>
-          <w:rFonts w:ascii="Arial" w:hAnsi="Arial" w:cs="Arial"/>
-        </w:rPr>
-        <w:t xml:space="preserve"> {{DESCRIPCION_FOTOGRAFIAS_ANEXAS}}</w:t>
-      </w:r>
-    </w:p>
-    <w:p>
-      <w:pPr>
-        <w:pStyle w:val="NormalWeb"/>
-        <w:rPr>
-          <w:rFonts w:ascii="Arial" w:hAnsi="Arial" w:cs="Arial"/>
-        </w:rPr>
-      </w:pPr>
-      <w:r>
-        <w:rPr>
-          <w:rStyle w:val="Textoennegrita"/>
-          <w:rFonts w:ascii="Arial" w:hAnsi="Arial" w:cs="Arial"/>
-        </w:rPr>
-        <w:t>1.2.</w:t>
-      </w:r>
-      <w:r>
-        <w:rPr>
-          <w:rFonts w:ascii="Arial" w:hAnsi="Arial" w:cs="Arial"/>
-        </w:rPr>
-        <w:t xml:space="preserve"> {{DESCRIPCION_VIDEOS_ANEXOS}}</w:t>
-      </w:r>
-    </w:p>
-    <w:p>
-      <w:pPr>
-        <w:pStyle w:val="NormalWeb"/>
-        <w:rPr>
-          <w:rFonts w:ascii="Arial" w:hAnsi="Arial" w:cs="Arial"/>
-        </w:rPr>
-      </w:pPr>
-      <w:r>
-        <w:rPr>
-          <w:rStyle w:val="Textoennegrita"/>
-          <w:rFonts w:ascii="Arial" w:hAnsi="Arial" w:cs="Arial"/>
-        </w:rPr>
-        <w:t>1.3.</w:t>
-      </w:r>
-      <w:r>
-        <w:rPr>
-          <w:rFonts w:ascii="Arial" w:hAnsi="Arial" w:cs="Arial"/>
-        </w:rPr>
-        <w:t xml:space="preserve"> {{DESCRIPCION_DOCUMENTOS_O_SOPORTES_ADICIONALES}}</w:t>
-      </w:r>
-    </w:p>
-    <w:p>
-      <w:pPr>
-        <w:pStyle w:val="Ttulo1"/>
-        <w:rPr>
-          <w:rFonts w:ascii="Arial" w:hAnsi="Arial" w:cs="Arial"/>
-          <w:sz w:val="24"/>
-          <w:szCs w:val="24"/>
-        </w:rPr>
-      </w:pPr>
-      <w:r>
-        <w:rPr>
-          <w:rFonts w:ascii="Arial" w:hAnsi="Arial" w:cs="Arial"/>
-          <w:sz w:val="24"/>
-          <w:szCs w:val="24"/>
-        </w:rPr>
-        <w:t>NOTIFICACIONES:</w:t>
+        <w:spacing w:before="80" w:after="80" w:line="240" w:lineRule="auto"/>
+        <w:rPr>
+          <w:rFonts w:ascii="Arial" w:hAnsi="Arial" w:cs="Arial"/>
+          <w:sz w:val="24"/>
+          <w:szCs w:val="24"/>
+        </w:rPr>
+      </w:pPr>
+      <w:r>
+        <w:rPr>
+          <w:rFonts w:ascii="Arial" w:hAnsi="Arial" w:cs="Arial"/>
+          <w:b/>
+          <w:bCs/>
+          <w:sz w:val="24"/>
+          <w:szCs w:val="24"/>
+        </w:rPr>
+        <w:t xml:space="preserve">1. </w:t>
+      </w:r>
+      <w:r>
+        <w:rPr>
+          <w:rFonts w:ascii="Arial" w:hAnsi="Arial" w:cs="Arial"/>
+          <w:sz w:val="24"/>
+          <w:szCs w:val="24"/>
+        </w:rPr>
+        <w:t xml:space="preserve">1. {{DESCRIPCION_FOTOGRAFIAS_ANEXAS}}</w:t>
+      </w:r>
+    </w:p>
+    <w:p>
+      <w:pPr>
+        <w:spacing w:before="80" w:after="80" w:line="240" w:lineRule="auto"/>
+        <w:rPr>
+          <w:rFonts w:ascii="Arial" w:hAnsi="Arial" w:cs="Arial"/>
+          <w:sz w:val="24"/>
+          <w:szCs w:val="24"/>
+        </w:rPr>
+      </w:pPr>
+      <w:r>
+        <w:rPr>
+          <w:rFonts w:ascii="Arial" w:hAnsi="Arial" w:cs="Arial"/>
+          <w:b/>
+          <w:bCs/>
+          <w:sz w:val="24"/>
+          <w:szCs w:val="24"/>
+        </w:rPr>
+        <w:t xml:space="preserve">1. </w:t>
+      </w:r>
+      <w:r>
+        <w:rPr>
+          <w:rFonts w:ascii="Arial" w:hAnsi="Arial" w:cs="Arial"/>
+          <w:sz w:val="24"/>
+          <w:szCs w:val="24"/>
+        </w:rPr>
+        <w:t xml:space="preserve">2. {{DESCRIPCION_VIDEOS_ANEXOS}}</w:t>
+      </w:r>
+    </w:p>
+    <w:p>
+      <w:pPr>
+        <w:spacing w:before="80" w:after="80" w:line="240" w:lineRule="auto"/>
+        <w:rPr>
+          <w:rFonts w:ascii="Arial" w:hAnsi="Arial" w:cs="Arial"/>
+          <w:sz w:val="24"/>
+          <w:szCs w:val="24"/>
+        </w:rPr>
+      </w:pPr>
+      <w:r>
+        <w:rPr>
+          <w:rFonts w:ascii="Arial" w:hAnsi="Arial" w:cs="Arial"/>
+          <w:b/>
+          <w:bCs/>
+          <w:sz w:val="24"/>
+          <w:szCs w:val="24"/>
+        </w:rPr>
+        <w:t xml:space="preserve">1. </w:t>
+      </w:r>
+      <w:r>
+        <w:rPr>
+          <w:rFonts w:ascii="Arial" w:hAnsi="Arial" w:cs="Arial"/>
+          <w:sz w:val="24"/>
+          <w:szCs w:val="24"/>
+        </w:rPr>
+        <w:t xml:space="preserve">3. {{DESCRIPCION_DOCUMENTOS_O_SOPORTES_ADICIONALES}}</w:t>
+      </w:r>
+    </w:p>
+    <w:p>
+      <w:pPr>
+        <w:spacing w:before="140" w:after="80" w:line="240" w:lineRule="auto"/>
+        <w:rPr>
+          <w:rFonts w:ascii="Arial" w:hAnsi="Arial" w:cs="Arial"/>
+          <w:b/>
+          <w:bCs/>
+          <w:sz w:val="24"/>
+          <w:szCs w:val="24"/>
+        </w:rPr>
+      </w:pPr>
+      <w:r>
+        <w:rPr>
+          <w:rFonts w:ascii="Arial" w:hAnsi="Arial" w:cs="Arial"/>
+          <w:b/>
+          <w:bCs/>
+          <w:sz w:val="24"/>
+          <w:szCs w:val="24"/>
+        </w:rPr>
+        <w:t xml:space="preserve">NOTIFICACIONES:</w:t>
       </w:r>
     </w:p>
     <w:p>

</xml_diff>